<commit_message>
Insert 2 Taiji/Bagua SVG diagrams after section 5 table in introduction.html (trilingual: ZH-TW, ZH-CN, EN); images from source-docs copied to img/
</commit_message>
<xml_diff>
--- a/docs/source-docs/AI-易經-G01-圖片-202610/AI-易經-G01-圖片-64掛爻象圖-202610/AI-易經-圖片-64掛爻象圖-svg-202610.docx
+++ b/docs/source-docs/AI-易經-G01-圖片-202610/AI-易經-G01-圖片-64掛爻象圖-202610/AI-易經-圖片-64掛爻象圖-svg-202610.docx
@@ -29,7 +29,7 @@
     <w:p>
       <w:pPr>
         <w:rPr>
-          <w:rFonts w:asciiTheme="minorEastAsia" w:hAnsiTheme="minorEastAsia"/>
+          <w:rFonts w:asciiTheme="minorEastAsia" w:hAnsiTheme="minorEastAsia" w:hint="eastAsia"/>
           <w:b/>
           <w:bCs/>
         </w:rPr>
@@ -164,6 +164,46 @@
       </w:r>
       <w:r>
         <w:rPr>
+          <w:rFonts w:asciiTheme="minorEastAsia" w:hAnsiTheme="minorEastAsia" w:hint="eastAsia"/>
+          <w:b/>
+          <w:bCs/>
+        </w:rPr>
+        <w:t xml:space="preserve"> </w:t>
+      </w:r>
+      <w:r>
+        <w:rPr>
+          <w:rFonts w:asciiTheme="minorEastAsia" w:hAnsiTheme="minorEastAsia" w:hint="eastAsia"/>
+          <w:b/>
+          <w:bCs/>
+        </w:rPr>
+        <w:t>「</w:t>
+      </w:r>
+      <w:r>
+        <w:rPr>
+          <w:rFonts w:asciiTheme="minorEastAsia" w:hAnsiTheme="minorEastAsia" w:hint="eastAsia"/>
+          <w:b/>
+          <w:bCs/>
+        </w:rPr>
+        <w:t>2張</w:t>
+      </w:r>
+      <w:r>
+        <w:rPr>
+          <w:rFonts w:asciiTheme="minorEastAsia" w:hAnsiTheme="minorEastAsia" w:hint="eastAsia"/>
+          <w:b/>
+          <w:bCs/>
+        </w:rPr>
+        <w:t>」</w:t>
+      </w:r>
+      <w:r>
+        <w:rPr>
+          <w:rFonts w:asciiTheme="minorEastAsia" w:hAnsiTheme="minorEastAsia" w:hint="eastAsia"/>
+          <w:b/>
+          <w:bCs/>
+        </w:rPr>
+        <w:t xml:space="preserve"> </w:t>
+      </w:r>
+      <w:r>
+        <w:rPr>
           <w:rFonts w:asciiTheme="minorEastAsia" w:hAnsiTheme="minorEastAsia"/>
           <w:b/>
           <w:bCs/>
@@ -187,6 +227,30 @@
           <w:bCs/>
         </w:rPr>
         <w:t>圖片</w:t>
+      </w:r>
+      <w:r>
+        <w:rPr>
+          <w:rFonts w:asciiTheme="minorEastAsia" w:hAnsiTheme="minorEastAsia" w:hint="eastAsia"/>
+          <w:b/>
+          <w:bCs/>
+        </w:rPr>
+        <w:t>，</w:t>
+      </w:r>
+      <w:r>
+        <w:rPr>
+          <w:rFonts w:asciiTheme="minorEastAsia" w:hAnsiTheme="minorEastAsia"/>
+          <w:b/>
+          <w:bCs/>
+        </w:rPr>
+        <w:t>[</w:t>
+      </w:r>
+      <w:r>
+        <w:rPr>
+          <w:rFonts w:asciiTheme="minorEastAsia" w:hAnsiTheme="minorEastAsia" w:hint="eastAsia"/>
+          <w:b/>
+          <w:bCs/>
+        </w:rPr>
+        <w:t xml:space="preserve">上下分開排列] </w:t>
       </w:r>
     </w:p>
     <w:p>
@@ -203,6 +267,14 @@
           <w:b/>
           <w:bCs/>
         </w:rPr>
+        <w:t>1、</w:t>
+      </w:r>
+      <w:r>
+        <w:rPr>
+          <w:rFonts w:asciiTheme="minorEastAsia" w:hAnsiTheme="minorEastAsia" w:hint="eastAsia"/>
+          <w:b/>
+          <w:bCs/>
+        </w:rPr>
         <w:t xml:space="preserve">標題為: </w:t>
       </w:r>
       <w:r>
@@ -216,6 +288,7 @@
     </w:p>
     <w:p>
       <w:pPr>
+        <w:ind w:firstLineChars="200" w:firstLine="480"/>
         <w:rPr>
           <w:rFonts w:asciiTheme="minorEastAsia" w:hAnsiTheme="minorEastAsia"/>
           <w:b/>
@@ -238,7 +311,115 @@
           <w:b/>
           <w:bCs/>
         </w:rPr>
-        <w:t xml:space="preserve">圖片: </w:t>
+        <w:t>圖片</w:t>
+      </w:r>
+      <w:r>
+        <w:rPr>
+          <w:rFonts w:asciiTheme="minorEastAsia" w:hAnsiTheme="minorEastAsia" w:hint="eastAsia"/>
+          <w:b/>
+          <w:bCs/>
+        </w:rPr>
+        <w:t xml:space="preserve">來源 </w:t>
+      </w:r>
+      <w:r>
+        <w:rPr>
+          <w:rFonts w:asciiTheme="minorEastAsia" w:hAnsiTheme="minorEastAsia" w:hint="eastAsia"/>
+          <w:b/>
+          <w:bCs/>
+        </w:rPr>
+        <w:t>:</w:t>
+      </w:r>
+      <w:r>
+        <w:rPr>
+          <w:rFonts w:asciiTheme="minorEastAsia" w:hAnsiTheme="minorEastAsia" w:hint="eastAsia"/>
+          <w:b/>
+          <w:bCs/>
+        </w:rPr>
+        <w:t xml:space="preserve"> </w:t>
+      </w:r>
+      <w:proofErr w:type="spellStart"/>
+      <w:r>
+        <w:rPr>
+          <w:rFonts w:asciiTheme="minorEastAsia" w:hAnsiTheme="minorEastAsia" w:hint="eastAsia"/>
+          <w:b/>
+          <w:bCs/>
+        </w:rPr>
+        <w:t>YiWordSite</w:t>
+      </w:r>
+      <w:proofErr w:type="spellEnd"/>
+      <w:r>
+        <w:rPr>
+          <w:rFonts w:asciiTheme="minorEastAsia" w:hAnsiTheme="minorEastAsia" w:hint="eastAsia"/>
+          <w:b/>
+          <w:bCs/>
+        </w:rPr>
+        <w:t xml:space="preserve"> 資料夾內、</w:t>
+      </w:r>
+      <w:r>
+        <w:rPr>
+          <w:rFonts w:asciiTheme="minorEastAsia" w:hAnsiTheme="minorEastAsia"/>
+          <w:b/>
+          <w:bCs/>
+        </w:rPr>
+        <w:t>d</w:t>
+      </w:r>
+      <w:r>
+        <w:rPr>
+          <w:rFonts w:asciiTheme="minorEastAsia" w:hAnsiTheme="minorEastAsia" w:hint="eastAsia"/>
+          <w:b/>
+          <w:bCs/>
+        </w:rPr>
+        <w:t>ocs內、</w:t>
+      </w:r>
+      <w:r>
+        <w:rPr>
+          <w:rFonts w:asciiTheme="minorEastAsia" w:hAnsiTheme="minorEastAsia"/>
+          <w:b/>
+          <w:bCs/>
+        </w:rPr>
+        <w:t>s</w:t>
+      </w:r>
+      <w:r>
+        <w:rPr>
+          <w:rFonts w:asciiTheme="minorEastAsia" w:hAnsiTheme="minorEastAsia" w:hint="eastAsia"/>
+          <w:b/>
+          <w:bCs/>
+        </w:rPr>
+        <w:t>ource docs內 之</w:t>
+      </w:r>
+      <w:r>
+        <w:rPr>
+          <w:rFonts w:asciiTheme="minorEastAsia" w:hAnsiTheme="minorEastAsia" w:hint="eastAsia"/>
+          <w:b/>
+          <w:bCs/>
+        </w:rPr>
+        <w:t xml:space="preserve"> </w:t>
+      </w:r>
+      <w:r>
+        <w:rPr>
+          <w:rFonts w:asciiTheme="minorEastAsia" w:hAnsiTheme="minorEastAsia" w:hint="eastAsia"/>
+          <w:b/>
+          <w:bCs/>
+        </w:rPr>
+        <w:t xml:space="preserve">   </w:t>
+      </w:r>
+    </w:p>
+    <w:p>
+      <w:pPr>
+        <w:ind w:firstLineChars="200" w:firstLine="480"/>
+        <w:rPr>
+          <w:rFonts w:asciiTheme="minorEastAsia" w:hAnsiTheme="minorEastAsia"/>
+          <w:b/>
+          <w:bCs/>
+        </w:rPr>
+      </w:pPr>
+      <w:r>
+        <w:rPr>
+          <w:rFonts w:asciiTheme="minorEastAsia" w:hAnsiTheme="minorEastAsia" w:hint="eastAsia"/>
+          <w:b/>
+          <w:bCs/>
+        </w:rPr>
+        <w:t xml:space="preserve"> </w:t>
       </w:r>
       <w:proofErr w:type="spellStart"/>
       <w:r>
@@ -254,84 +435,53 @@
     <w:p>
       <w:pPr>
         <w:rPr>
-          <w:rFonts w:ascii="微軟正黑體" w:eastAsia="微軟正黑體" w:hAnsi="微軟正黑體"/>
-          <w:b/>
-          <w:bCs/>
-        </w:rPr>
-      </w:pPr>
+          <w:rFonts w:asciiTheme="minorEastAsia" w:hAnsiTheme="minorEastAsia"/>
+          <w:b/>
+          <w:bCs/>
+        </w:rPr>
+      </w:pPr>
+      <w:r>
+        <w:rPr>
+          <w:rFonts w:asciiTheme="minorEastAsia" w:hAnsiTheme="minorEastAsia" w:hint="eastAsia"/>
+          <w:b/>
+          <w:bCs/>
+        </w:rPr>
+        <w:t>2、</w:t>
+      </w:r>
+      <w:r>
+        <w:rPr>
+          <w:rFonts w:asciiTheme="minorEastAsia" w:hAnsiTheme="minorEastAsia" w:hint="eastAsia"/>
+          <w:b/>
+          <w:bCs/>
+        </w:rPr>
+        <w:t>標題為:</w:t>
+      </w:r>
+      <w:r>
+        <w:rPr>
+          <w:rFonts w:asciiTheme="minorEastAsia" w:hAnsiTheme="minorEastAsia" w:hint="eastAsia"/>
+          <w:b/>
+          <w:bCs/>
+        </w:rPr>
+        <w:t xml:space="preserve"> </w:t>
+      </w:r>
+      <w:r>
+        <w:rPr>
+          <w:rFonts w:asciiTheme="minorEastAsia" w:hAnsiTheme="minorEastAsia"/>
+          <w:b/>
+          <w:bCs/>
+        </w:rPr>
+        <w:t>兩儀四象八卦圖</w:t>
+      </w:r>
     </w:p>
     <w:p>
       <w:pPr>
-        <w:rPr>
-          <w:rFonts w:asciiTheme="minorEastAsia" w:hAnsiTheme="minorEastAsia"/>
-          <w:b/>
-          <w:bCs/>
-        </w:rPr>
-      </w:pPr>
-      <w:r>
-        <w:rPr>
-          <w:rFonts w:asciiTheme="minorEastAsia" w:hAnsiTheme="minorEastAsia" w:hint="eastAsia"/>
-          <w:b/>
-          <w:bCs/>
-        </w:rPr>
-        <w:t>在 「</w:t>
-      </w:r>
-      <w:r>
-        <w:rPr>
-          <w:rFonts w:asciiTheme="minorEastAsia" w:hAnsiTheme="minorEastAsia" w:hint="eastAsia"/>
-          <w:b/>
-          <w:bCs/>
-        </w:rPr>
-        <w:t>簡</w:t>
-      </w:r>
-      <w:r>
-        <w:rPr>
-          <w:rFonts w:asciiTheme="minorEastAsia" w:hAnsiTheme="minorEastAsia" w:hint="eastAsia"/>
-          <w:b/>
-          <w:bCs/>
-        </w:rPr>
-        <w:t>體中文版」 、 「</w:t>
-      </w:r>
-      <w:r>
-        <w:rPr>
-          <w:rFonts w:asciiTheme="minorEastAsia" w:hAnsiTheme="minorEastAsia"/>
-          <w:b/>
-          <w:bCs/>
-        </w:rPr>
-        <w:t>易經介紹</w:t>
-      </w:r>
-      <w:r>
-        <w:rPr>
-          <w:rFonts w:asciiTheme="minorEastAsia" w:hAnsiTheme="minorEastAsia" w:hint="eastAsia"/>
-          <w:b/>
-          <w:bCs/>
-        </w:rPr>
-        <w:t>」 頁面內容裡， 「</w:t>
-      </w:r>
-      <w:r>
-        <w:rPr>
-          <w:rFonts w:asciiTheme="minorEastAsia" w:hAnsiTheme="minorEastAsia"/>
-          <w:b/>
-          <w:bCs/>
-        </w:rPr>
-        <w:t>五、陰陽、八卦與六十四卦</w:t>
-      </w:r>
-      <w:r>
-        <w:rPr>
-          <w:rFonts w:asciiTheme="minorEastAsia" w:hAnsiTheme="minorEastAsia" w:hint="eastAsia"/>
-          <w:b/>
-          <w:bCs/>
-        </w:rPr>
-        <w:t>」 表格下方 ，插入下列</w:t>
-      </w:r>
-      <w:r>
-        <w:rPr>
-          <w:rFonts w:asciiTheme="minorEastAsia" w:hAnsiTheme="minorEastAsia"/>
-          <w:b/>
-          <w:bCs/>
-        </w:rPr>
-        <w:t>64掛爻象圖</w:t>
-      </w:r>
+        <w:ind w:firstLineChars="200" w:firstLine="480"/>
+        <w:rPr>
+          <w:rFonts w:asciiTheme="minorEastAsia" w:hAnsiTheme="minorEastAsia"/>
+          <w:b/>
+          <w:bCs/>
+        </w:rPr>
+      </w:pPr>
       <w:proofErr w:type="spellStart"/>
       <w:r>
         <w:rPr>
@@ -349,37 +499,104 @@
           <w:bCs/>
         </w:rPr>
         <w:t>圖片</w:t>
+      </w:r>
+      <w:r>
+        <w:rPr>
+          <w:rFonts w:asciiTheme="minorEastAsia" w:hAnsiTheme="minorEastAsia" w:hint="eastAsia"/>
+          <w:b/>
+          <w:bCs/>
+        </w:rPr>
+        <w:t xml:space="preserve">來源 </w:t>
+      </w:r>
+      <w:r>
+        <w:rPr>
+          <w:rFonts w:asciiTheme="minorEastAsia" w:hAnsiTheme="minorEastAsia" w:hint="eastAsia"/>
+          <w:b/>
+          <w:bCs/>
+        </w:rPr>
+        <w:t>:</w:t>
+      </w:r>
+      <w:r>
+        <w:rPr>
+          <w:rFonts w:asciiTheme="minorEastAsia" w:hAnsiTheme="minorEastAsia" w:hint="eastAsia"/>
+          <w:b/>
+          <w:bCs/>
+        </w:rPr>
+        <w:t xml:space="preserve"> </w:t>
+      </w:r>
+      <w:proofErr w:type="spellStart"/>
+      <w:r>
+        <w:rPr>
+          <w:rFonts w:asciiTheme="minorEastAsia" w:hAnsiTheme="minorEastAsia" w:hint="eastAsia"/>
+          <w:b/>
+          <w:bCs/>
+        </w:rPr>
+        <w:t>YiWordSite</w:t>
+      </w:r>
+      <w:proofErr w:type="spellEnd"/>
+      <w:r>
+        <w:rPr>
+          <w:rFonts w:asciiTheme="minorEastAsia" w:hAnsiTheme="minorEastAsia" w:hint="eastAsia"/>
+          <w:b/>
+          <w:bCs/>
+        </w:rPr>
+        <w:t xml:space="preserve"> 資料夾內、</w:t>
+      </w:r>
+      <w:r>
+        <w:rPr>
+          <w:rFonts w:asciiTheme="minorEastAsia" w:hAnsiTheme="minorEastAsia"/>
+          <w:b/>
+          <w:bCs/>
+        </w:rPr>
+        <w:t>d</w:t>
+      </w:r>
+      <w:r>
+        <w:rPr>
+          <w:rFonts w:asciiTheme="minorEastAsia" w:hAnsiTheme="minorEastAsia" w:hint="eastAsia"/>
+          <w:b/>
+          <w:bCs/>
+        </w:rPr>
+        <w:t>ocs內、</w:t>
+      </w:r>
+      <w:r>
+        <w:rPr>
+          <w:rFonts w:asciiTheme="minorEastAsia" w:hAnsiTheme="minorEastAsia"/>
+          <w:b/>
+          <w:bCs/>
+        </w:rPr>
+        <w:t>s</w:t>
+      </w:r>
+      <w:r>
+        <w:rPr>
+          <w:rFonts w:asciiTheme="minorEastAsia" w:hAnsiTheme="minorEastAsia" w:hint="eastAsia"/>
+          <w:b/>
+          <w:bCs/>
+        </w:rPr>
+        <w:t>ource docs內 之</w:t>
+      </w:r>
+      <w:r>
+        <w:rPr>
+          <w:rFonts w:asciiTheme="minorEastAsia" w:hAnsiTheme="minorEastAsia" w:hint="eastAsia"/>
+          <w:b/>
+          <w:bCs/>
+        </w:rPr>
+        <w:t xml:space="preserve"> </w:t>
+      </w:r>
+      <w:r>
+        <w:rPr>
+          <w:rFonts w:asciiTheme="minorEastAsia" w:hAnsiTheme="minorEastAsia" w:hint="eastAsia"/>
+          <w:b/>
+          <w:bCs/>
+        </w:rPr>
+        <w:t xml:space="preserve">   </w:t>
       </w:r>
     </w:p>
     <w:p>
       <w:pPr>
-        <w:rPr>
-          <w:rFonts w:asciiTheme="minorEastAsia" w:hAnsiTheme="minorEastAsia"/>
-          <w:b/>
-          <w:bCs/>
-        </w:rPr>
-      </w:pPr>
-      <w:r>
-        <w:rPr>
-          <w:rFonts w:asciiTheme="minorEastAsia" w:hAnsiTheme="minorEastAsia" w:hint="eastAsia"/>
-          <w:b/>
-          <w:bCs/>
-        </w:rPr>
-        <w:t xml:space="preserve">標題為: </w:t>
-      </w:r>
-      <w:r>
-        <w:rPr>
-          <w:rFonts w:asciiTheme="minorEastAsia" w:hAnsiTheme="minorEastAsia"/>
-          <w:b/>
-          <w:bCs/>
-        </w:rPr>
-        <w:t>太極兩儀四象八卦圖</w:t>
-      </w:r>
-    </w:p>
-    <w:p>
-      <w:pPr>
-        <w:rPr>
-          <w:rFonts w:asciiTheme="minorEastAsia" w:hAnsiTheme="minorEastAsia"/>
+        <w:pStyle w:val="a9"/>
+        <w:ind w:left="390" w:firstLineChars="100" w:firstLine="240"/>
+        <w:rPr>
+          <w:rFonts w:asciiTheme="minorEastAsia" w:hAnsiTheme="minorEastAsia" w:hint="eastAsia"/>
           <w:b/>
           <w:bCs/>
         </w:rPr>
@@ -391,33 +608,7 @@
           <w:b/>
           <w:bCs/>
         </w:rPr>
-        <w:t>svg</w:t>
-      </w:r>
-      <w:proofErr w:type="spellEnd"/>
-      <w:r>
-        <w:rPr>
-          <w:rFonts w:asciiTheme="minorEastAsia" w:hAnsiTheme="minorEastAsia" w:hint="eastAsia"/>
-          <w:b/>
-          <w:bCs/>
-        </w:rPr>
-        <w:t>圖片:</w:t>
-      </w:r>
-      <w:r>
-        <w:rPr>
-          <w:rFonts w:asciiTheme="minorEastAsia" w:hAnsiTheme="minorEastAsia" w:hint="eastAsia"/>
-          <w:b/>
-          <w:bCs/>
-        </w:rPr>
-        <w:t xml:space="preserve"> </w:t>
-      </w:r>
-      <w:proofErr w:type="spellStart"/>
-      <w:r>
-        <w:rPr>
-          <w:rFonts w:asciiTheme="minorEastAsia" w:hAnsiTheme="minorEastAsia"/>
-          <w:b/>
-          <w:bCs/>
-        </w:rPr>
-        <w:t>YiWord_Taiji_Bagua_ZH_CN_Diagram_Only</w:t>
+        <w:t>YiWord_Taiji_Bagua_ZH_TW_Vector</w:t>
       </w:r>
       <w:proofErr w:type="spellEnd"/>
     </w:p>
@@ -425,99 +616,19 @@
       <w:pPr>
         <w:rPr>
           <w:rFonts w:ascii="微軟正黑體" w:eastAsia="微軟正黑體" w:hAnsi="微軟正黑體"/>
+          <w:b/>
+          <w:bCs/>
         </w:rPr>
       </w:pPr>
     </w:p>
     <w:p>
       <w:pPr>
         <w:rPr>
-          <w:rFonts w:asciiTheme="minorEastAsia" w:hAnsiTheme="minorEastAsia"/>
-          <w:b/>
-          <w:bCs/>
-        </w:rPr>
-      </w:pPr>
-      <w:r>
-        <w:rPr>
-          <w:rFonts w:asciiTheme="minorEastAsia" w:hAnsiTheme="minorEastAsia" w:hint="eastAsia"/>
-          <w:b/>
-          <w:bCs/>
-        </w:rPr>
-        <w:t>在 「</w:t>
-      </w:r>
-      <w:r>
-        <w:rPr>
-          <w:rFonts w:asciiTheme="minorEastAsia" w:hAnsiTheme="minorEastAsia" w:hint="eastAsia"/>
-          <w:b/>
-          <w:bCs/>
-        </w:rPr>
-        <w:t>EN英</w:t>
-      </w:r>
-      <w:r>
-        <w:rPr>
-          <w:rFonts w:asciiTheme="minorEastAsia" w:hAnsiTheme="minorEastAsia" w:hint="eastAsia"/>
-          <w:b/>
-          <w:bCs/>
-        </w:rPr>
-        <w:t>文版」 、 「</w:t>
-      </w:r>
-      <w:r>
-        <w:rPr>
-          <w:rFonts w:asciiTheme="minorEastAsia" w:hAnsiTheme="minorEastAsia"/>
-          <w:b/>
-          <w:bCs/>
-        </w:rPr>
-        <w:t>易經介紹</w:t>
-      </w:r>
-      <w:r>
-        <w:rPr>
-          <w:rFonts w:asciiTheme="minorEastAsia" w:hAnsiTheme="minorEastAsia" w:hint="eastAsia"/>
-          <w:b/>
-          <w:bCs/>
-        </w:rPr>
-        <w:t>」 頁面內容裡， 「</w:t>
-      </w:r>
-      <w:r>
-        <w:rPr>
-          <w:rFonts w:asciiTheme="minorEastAsia" w:hAnsiTheme="minorEastAsia"/>
-          <w:b/>
-          <w:bCs/>
-        </w:rPr>
-        <w:t>五、陰陽、八卦與六十四卦</w:t>
-      </w:r>
-      <w:r>
-        <w:rPr>
-          <w:rFonts w:asciiTheme="minorEastAsia" w:hAnsiTheme="minorEastAsia" w:hint="eastAsia"/>
-          <w:b/>
-          <w:bCs/>
-        </w:rPr>
-        <w:t>」 表格下方 ，插入下列</w:t>
-      </w:r>
-      <w:r>
-        <w:rPr>
-          <w:rFonts w:asciiTheme="minorEastAsia" w:hAnsiTheme="minorEastAsia"/>
-          <w:b/>
-          <w:bCs/>
-        </w:rPr>
-        <w:t>64掛爻象圖</w:t>
-      </w:r>
-      <w:proofErr w:type="spellStart"/>
-      <w:r>
-        <w:rPr>
-          <w:rFonts w:asciiTheme="minorEastAsia" w:hAnsiTheme="minorEastAsia"/>
-          <w:b/>
-          <w:bCs/>
-        </w:rPr>
-        <w:t>svg</w:t>
-      </w:r>
-      <w:proofErr w:type="spellEnd"/>
-      <w:r>
-        <w:rPr>
-          <w:rFonts w:asciiTheme="minorEastAsia" w:hAnsiTheme="minorEastAsia" w:hint="eastAsia"/>
-          <w:b/>
-          <w:bCs/>
-        </w:rPr>
-        <w:t>圖片</w:t>
-      </w:r>
+          <w:rFonts w:ascii="微軟正黑體" w:eastAsia="微軟正黑體" w:hAnsi="微軟正黑體" w:hint="eastAsia"/>
+          <w:b/>
+          <w:bCs/>
+        </w:rPr>
+      </w:pPr>
     </w:p>
     <w:p>
       <w:pPr>
@@ -533,15 +644,145 @@
           <w:b/>
           <w:bCs/>
         </w:rPr>
-        <w:t xml:space="preserve">標題為: </w:t>
-      </w:r>
-      <w:r>
-        <w:rPr>
-          <w:rFonts w:asciiTheme="minorEastAsia" w:hAnsiTheme="minorEastAsia"/>
-          <w:b/>
-          <w:bCs/>
-        </w:rPr>
-        <w:t>太極兩儀四象八卦圖</w:t>
+        <w:t>在 「</w:t>
+      </w:r>
+      <w:r>
+        <w:rPr>
+          <w:rFonts w:asciiTheme="minorEastAsia" w:hAnsiTheme="minorEastAsia" w:hint="eastAsia"/>
+          <w:b/>
+          <w:bCs/>
+        </w:rPr>
+        <w:t>簡</w:t>
+      </w:r>
+      <w:r>
+        <w:rPr>
+          <w:rFonts w:asciiTheme="minorEastAsia" w:hAnsiTheme="minorEastAsia" w:hint="eastAsia"/>
+          <w:b/>
+          <w:bCs/>
+        </w:rPr>
+        <w:t>體中文版」 、 「</w:t>
+      </w:r>
+      <w:r>
+        <w:rPr>
+          <w:rFonts w:asciiTheme="minorEastAsia" w:hAnsiTheme="minorEastAsia"/>
+          <w:b/>
+          <w:bCs/>
+        </w:rPr>
+        <w:t>易經介紹</w:t>
+      </w:r>
+      <w:r>
+        <w:rPr>
+          <w:rFonts w:asciiTheme="minorEastAsia" w:hAnsiTheme="minorEastAsia" w:hint="eastAsia"/>
+          <w:b/>
+          <w:bCs/>
+        </w:rPr>
+        <w:t>」 頁面內容裡， 「</w:t>
+      </w:r>
+      <w:r>
+        <w:rPr>
+          <w:rFonts w:asciiTheme="minorEastAsia" w:hAnsiTheme="minorEastAsia"/>
+          <w:b/>
+          <w:bCs/>
+        </w:rPr>
+        <w:t>五、陰陽、八卦與六十四卦</w:t>
+      </w:r>
+      <w:r>
+        <w:rPr>
+          <w:rFonts w:asciiTheme="minorEastAsia" w:hAnsiTheme="minorEastAsia" w:hint="eastAsia"/>
+          <w:b/>
+          <w:bCs/>
+        </w:rPr>
+        <w:t>」 表格下方 ，插入下列</w:t>
+      </w:r>
+      <w:r>
+        <w:rPr>
+          <w:rFonts w:asciiTheme="minorEastAsia" w:hAnsiTheme="minorEastAsia" w:hint="eastAsia"/>
+          <w:b/>
+          <w:bCs/>
+        </w:rPr>
+        <w:t xml:space="preserve"> </w:t>
+      </w:r>
+      <w:r>
+        <w:rPr>
+          <w:rFonts w:asciiTheme="minorEastAsia" w:hAnsiTheme="minorEastAsia" w:hint="eastAsia"/>
+          <w:b/>
+          <w:bCs/>
+        </w:rPr>
+        <w:t>「</w:t>
+      </w:r>
+      <w:r>
+        <w:rPr>
+          <w:rFonts w:asciiTheme="minorEastAsia" w:hAnsiTheme="minorEastAsia" w:hint="eastAsia"/>
+          <w:b/>
+          <w:bCs/>
+        </w:rPr>
+        <w:t>2張</w:t>
+      </w:r>
+      <w:r>
+        <w:rPr>
+          <w:rFonts w:asciiTheme="minorEastAsia" w:hAnsiTheme="minorEastAsia" w:hint="eastAsia"/>
+          <w:b/>
+          <w:bCs/>
+        </w:rPr>
+        <w:t>」</w:t>
+      </w:r>
+      <w:r>
+        <w:rPr>
+          <w:rFonts w:asciiTheme="minorEastAsia" w:hAnsiTheme="minorEastAsia" w:hint="eastAsia"/>
+          <w:b/>
+          <w:bCs/>
+        </w:rPr>
+        <w:t xml:space="preserve"> </w:t>
+      </w:r>
+      <w:r>
+        <w:rPr>
+          <w:rFonts w:asciiTheme="minorEastAsia" w:hAnsiTheme="minorEastAsia"/>
+          <w:b/>
+          <w:bCs/>
+        </w:rPr>
+        <w:t>64掛爻象圖</w:t>
+      </w:r>
+      <w:proofErr w:type="spellStart"/>
+      <w:r>
+        <w:rPr>
+          <w:rFonts w:asciiTheme="minorEastAsia" w:hAnsiTheme="minorEastAsia"/>
+          <w:b/>
+          <w:bCs/>
+        </w:rPr>
+        <w:t>svg</w:t>
+      </w:r>
+      <w:proofErr w:type="spellEnd"/>
+      <w:r>
+        <w:rPr>
+          <w:rFonts w:asciiTheme="minorEastAsia" w:hAnsiTheme="minorEastAsia" w:hint="eastAsia"/>
+          <w:b/>
+          <w:bCs/>
+        </w:rPr>
+        <w:t>圖片</w:t>
+      </w:r>
+      <w:r>
+        <w:rPr>
+          <w:rFonts w:asciiTheme="minorEastAsia" w:hAnsiTheme="minorEastAsia" w:hint="eastAsia"/>
+          <w:b/>
+          <w:bCs/>
+        </w:rPr>
+        <w:t>，</w:t>
+      </w:r>
+      <w:r>
+        <w:rPr>
+          <w:rFonts w:asciiTheme="minorEastAsia" w:hAnsiTheme="minorEastAsia"/>
+          <w:b/>
+          <w:bCs/>
+        </w:rPr>
+        <w:t>[</w:t>
+      </w:r>
+      <w:r>
+        <w:rPr>
+          <w:rFonts w:asciiTheme="minorEastAsia" w:hAnsiTheme="minorEastAsia" w:hint="eastAsia"/>
+          <w:b/>
+          <w:bCs/>
+        </w:rPr>
+        <w:t>上下分開排列]</w:t>
       </w:r>
     </w:p>
     <w:p>
@@ -552,6 +793,48 @@
           <w:bCs/>
         </w:rPr>
       </w:pPr>
+      <w:r>
+        <w:rPr>
+          <w:rFonts w:asciiTheme="minorEastAsia" w:hAnsiTheme="minorEastAsia" w:hint="eastAsia"/>
+          <w:b/>
+          <w:bCs/>
+        </w:rPr>
+        <w:t>1、</w:t>
+      </w:r>
+      <w:r>
+        <w:rPr>
+          <w:rFonts w:asciiTheme="minorEastAsia" w:hAnsiTheme="minorEastAsia" w:hint="eastAsia"/>
+          <w:b/>
+          <w:bCs/>
+        </w:rPr>
+        <w:t xml:space="preserve">標題為: </w:t>
+      </w:r>
+      <w:r>
+        <w:rPr>
+          <w:rFonts w:asciiTheme="minorEastAsia" w:hAnsiTheme="minorEastAsia"/>
+          <w:b/>
+          <w:bCs/>
+        </w:rPr>
+        <w:t>太極兩儀四象八卦圖</w:t>
+      </w:r>
+    </w:p>
+    <w:p>
+      <w:pPr>
+        <w:ind w:firstLineChars="200" w:firstLine="480"/>
+        <w:rPr>
+          <w:rFonts w:asciiTheme="minorEastAsia" w:hAnsiTheme="minorEastAsia"/>
+          <w:b/>
+          <w:bCs/>
+        </w:rPr>
+      </w:pPr>
+      <w:r>
+        <w:rPr>
+          <w:rFonts w:asciiTheme="minorEastAsia" w:hAnsiTheme="minorEastAsia" w:hint="eastAsia"/>
+          <w:b/>
+          <w:bCs/>
+        </w:rPr>
+        <w:t xml:space="preserve"> </w:t>
+      </w:r>
       <w:proofErr w:type="spellStart"/>
       <w:r>
         <w:rPr>
@@ -568,7 +851,23 @@
           <w:b/>
           <w:bCs/>
         </w:rPr>
-        <w:t>圖片:</w:t>
+        <w:t>圖片</w:t>
+      </w:r>
+      <w:r>
+        <w:rPr>
+          <w:rFonts w:asciiTheme="minorEastAsia" w:hAnsiTheme="minorEastAsia" w:hint="eastAsia"/>
+          <w:b/>
+          <w:bCs/>
+        </w:rPr>
+        <w:t xml:space="preserve">來源 </w:t>
+      </w:r>
+      <w:r>
+        <w:rPr>
+          <w:rFonts w:asciiTheme="minorEastAsia" w:hAnsiTheme="minorEastAsia" w:hint="eastAsia"/>
+          <w:b/>
+          <w:bCs/>
+        </w:rPr>
+        <w:t>:</w:t>
       </w:r>
       <w:r>
         <w:rPr>
@@ -581,92 +880,258 @@
       <w:proofErr w:type="spellStart"/>
       <w:r>
         <w:rPr>
-          <w:rFonts w:asciiTheme="minorEastAsia" w:hAnsiTheme="minorEastAsia"/>
-          <w:b/>
-          <w:bCs/>
-        </w:rPr>
-        <w:t>YiWord_Taiji_Bagua_ZH_TW_EN_Diagram_Only</w:t>
+          <w:rFonts w:asciiTheme="minorEastAsia" w:hAnsiTheme="minorEastAsia" w:hint="eastAsia"/>
+          <w:b/>
+          <w:bCs/>
+        </w:rPr>
+        <w:t>YiWordSite</w:t>
+      </w:r>
+      <w:proofErr w:type="spellEnd"/>
+      <w:r>
+        <w:rPr>
+          <w:rFonts w:asciiTheme="minorEastAsia" w:hAnsiTheme="minorEastAsia" w:hint="eastAsia"/>
+          <w:b/>
+          <w:bCs/>
+        </w:rPr>
+        <w:t xml:space="preserve"> 資料夾內、</w:t>
+      </w:r>
+      <w:r>
+        <w:rPr>
+          <w:rFonts w:asciiTheme="minorEastAsia" w:hAnsiTheme="minorEastAsia"/>
+          <w:b/>
+          <w:bCs/>
+        </w:rPr>
+        <w:t>d</w:t>
+      </w:r>
+      <w:r>
+        <w:rPr>
+          <w:rFonts w:asciiTheme="minorEastAsia" w:hAnsiTheme="minorEastAsia" w:hint="eastAsia"/>
+          <w:b/>
+          <w:bCs/>
+        </w:rPr>
+        <w:t>ocs內、</w:t>
+      </w:r>
+      <w:r>
+        <w:rPr>
+          <w:rFonts w:asciiTheme="minorEastAsia" w:hAnsiTheme="minorEastAsia"/>
+          <w:b/>
+          <w:bCs/>
+        </w:rPr>
+        <w:t>s</w:t>
+      </w:r>
+      <w:r>
+        <w:rPr>
+          <w:rFonts w:asciiTheme="minorEastAsia" w:hAnsiTheme="minorEastAsia" w:hint="eastAsia"/>
+          <w:b/>
+          <w:bCs/>
+        </w:rPr>
+        <w:t>ource docs內 之</w:t>
+      </w:r>
+      <w:r>
+        <w:rPr>
+          <w:rFonts w:asciiTheme="minorEastAsia" w:hAnsiTheme="minorEastAsia" w:hint="eastAsia"/>
+          <w:b/>
+          <w:bCs/>
+        </w:rPr>
+        <w:t xml:space="preserve"> </w:t>
+      </w:r>
+      <w:r>
+        <w:rPr>
+          <w:rFonts w:asciiTheme="minorEastAsia" w:hAnsiTheme="minorEastAsia" w:hint="eastAsia"/>
+          <w:b/>
+          <w:bCs/>
+        </w:rPr>
+        <w:t xml:space="preserve">   </w:t>
+      </w:r>
+    </w:p>
+    <w:p>
+      <w:pPr>
+        <w:rPr>
+          <w:rFonts w:asciiTheme="minorEastAsia" w:hAnsiTheme="minorEastAsia"/>
+          <w:b/>
+          <w:bCs/>
+        </w:rPr>
+      </w:pPr>
+      <w:r>
+        <w:rPr>
+          <w:rFonts w:asciiTheme="minorEastAsia" w:hAnsiTheme="minorEastAsia" w:hint="eastAsia"/>
+          <w:b/>
+          <w:bCs/>
+        </w:rPr>
+        <w:t xml:space="preserve">      </w:t>
+      </w:r>
+      <w:proofErr w:type="spellStart"/>
+      <w:r>
+        <w:rPr>
+          <w:rFonts w:asciiTheme="minorEastAsia" w:hAnsiTheme="minorEastAsia"/>
+          <w:b/>
+          <w:bCs/>
+        </w:rPr>
+        <w:t>YiWord_Taiji_Bagua_ZH_CN_Diagram_Only</w:t>
       </w:r>
       <w:proofErr w:type="spellEnd"/>
     </w:p>
     <w:p>
       <w:pPr>
         <w:rPr>
-          <w:rFonts w:ascii="微軟正黑體" w:eastAsia="微軟正黑體" w:hAnsi="微軟正黑體"/>
-        </w:rPr>
-      </w:pPr>
+          <w:rFonts w:asciiTheme="minorEastAsia" w:hAnsiTheme="minorEastAsia"/>
+          <w:b/>
+          <w:bCs/>
+        </w:rPr>
+      </w:pPr>
+      <w:r>
+        <w:rPr>
+          <w:rFonts w:asciiTheme="minorEastAsia" w:hAnsiTheme="minorEastAsia" w:hint="eastAsia"/>
+          <w:b/>
+          <w:bCs/>
+        </w:rPr>
+        <w:t>2、</w:t>
+      </w:r>
+      <w:r>
+        <w:rPr>
+          <w:rFonts w:asciiTheme="minorEastAsia" w:hAnsiTheme="minorEastAsia" w:hint="eastAsia"/>
+          <w:b/>
+          <w:bCs/>
+        </w:rPr>
+        <w:t xml:space="preserve">標題為: </w:t>
+      </w:r>
+      <w:r>
+        <w:rPr>
+          <w:rFonts w:asciiTheme="minorEastAsia" w:hAnsiTheme="minorEastAsia"/>
+          <w:b/>
+          <w:bCs/>
+        </w:rPr>
+        <w:t>兩儀四象八卦圖</w:t>
+      </w:r>
     </w:p>
     <w:p>
       <w:pPr>
-        <w:widowControl/>
-        <w:rPr>
-          <w:rFonts w:ascii="微軟正黑體" w:eastAsia="微軟正黑體" w:hAnsi="微軟正黑體"/>
-        </w:rPr>
-      </w:pPr>
-      <w:r>
-        <w:rPr>
-          <w:rFonts w:ascii="微軟正黑體" w:eastAsia="微軟正黑體" w:hAnsi="微軟正黑體"/>
-        </w:rPr>
-        <w:br w:type="page"/>
+        <w:ind w:firstLineChars="200" w:firstLine="480"/>
+        <w:rPr>
+          <w:rFonts w:asciiTheme="minorEastAsia" w:hAnsiTheme="minorEastAsia"/>
+          <w:b/>
+          <w:bCs/>
+        </w:rPr>
+      </w:pPr>
+      <w:proofErr w:type="spellStart"/>
+      <w:r>
+        <w:rPr>
+          <w:rFonts w:asciiTheme="minorEastAsia" w:hAnsiTheme="minorEastAsia"/>
+          <w:b/>
+          <w:bCs/>
+        </w:rPr>
+        <w:t>svg</w:t>
+      </w:r>
+      <w:proofErr w:type="spellEnd"/>
+      <w:r>
+        <w:rPr>
+          <w:rFonts w:asciiTheme="minorEastAsia" w:hAnsiTheme="minorEastAsia" w:hint="eastAsia"/>
+          <w:b/>
+          <w:bCs/>
+        </w:rPr>
+        <w:t>圖片</w:t>
+      </w:r>
+      <w:r>
+        <w:rPr>
+          <w:rFonts w:asciiTheme="minorEastAsia" w:hAnsiTheme="minorEastAsia" w:hint="eastAsia"/>
+          <w:b/>
+          <w:bCs/>
+        </w:rPr>
+        <w:t xml:space="preserve">來源 </w:t>
+      </w:r>
+      <w:r>
+        <w:rPr>
+          <w:rFonts w:asciiTheme="minorEastAsia" w:hAnsiTheme="minorEastAsia" w:hint="eastAsia"/>
+          <w:b/>
+          <w:bCs/>
+        </w:rPr>
+        <w:t>:</w:t>
+      </w:r>
+      <w:r>
+        <w:rPr>
+          <w:rFonts w:asciiTheme="minorEastAsia" w:hAnsiTheme="minorEastAsia" w:hint="eastAsia"/>
+          <w:b/>
+          <w:bCs/>
+        </w:rPr>
+        <w:t xml:space="preserve"> </w:t>
+      </w:r>
+      <w:proofErr w:type="spellStart"/>
+      <w:r>
+        <w:rPr>
+          <w:rFonts w:asciiTheme="minorEastAsia" w:hAnsiTheme="minorEastAsia" w:hint="eastAsia"/>
+          <w:b/>
+          <w:bCs/>
+        </w:rPr>
+        <w:t>YiWordSite</w:t>
+      </w:r>
+      <w:proofErr w:type="spellEnd"/>
+      <w:r>
+        <w:rPr>
+          <w:rFonts w:asciiTheme="minorEastAsia" w:hAnsiTheme="minorEastAsia" w:hint="eastAsia"/>
+          <w:b/>
+          <w:bCs/>
+        </w:rPr>
+        <w:t xml:space="preserve"> 資料夾內、</w:t>
+      </w:r>
+      <w:r>
+        <w:rPr>
+          <w:rFonts w:asciiTheme="minorEastAsia" w:hAnsiTheme="minorEastAsia"/>
+          <w:b/>
+          <w:bCs/>
+        </w:rPr>
+        <w:t>d</w:t>
+      </w:r>
+      <w:r>
+        <w:rPr>
+          <w:rFonts w:asciiTheme="minorEastAsia" w:hAnsiTheme="minorEastAsia" w:hint="eastAsia"/>
+          <w:b/>
+          <w:bCs/>
+        </w:rPr>
+        <w:t>ocs內、</w:t>
+      </w:r>
+      <w:r>
+        <w:rPr>
+          <w:rFonts w:asciiTheme="minorEastAsia" w:hAnsiTheme="minorEastAsia"/>
+          <w:b/>
+          <w:bCs/>
+        </w:rPr>
+        <w:t>s</w:t>
+      </w:r>
+      <w:r>
+        <w:rPr>
+          <w:rFonts w:asciiTheme="minorEastAsia" w:hAnsiTheme="minorEastAsia" w:hint="eastAsia"/>
+          <w:b/>
+          <w:bCs/>
+        </w:rPr>
+        <w:t>ource docs內 之</w:t>
+      </w:r>
+      <w:r>
+        <w:rPr>
+          <w:rFonts w:asciiTheme="minorEastAsia" w:hAnsiTheme="minorEastAsia" w:hint="eastAsia"/>
+          <w:b/>
+          <w:bCs/>
+        </w:rPr>
+        <w:t xml:space="preserve"> </w:t>
+      </w:r>
+      <w:r>
+        <w:rPr>
+          <w:rFonts w:asciiTheme="minorEastAsia" w:hAnsiTheme="minorEastAsia" w:hint="eastAsia"/>
+          <w:b/>
+          <w:bCs/>
+        </w:rPr>
+        <w:t xml:space="preserve">   </w:t>
       </w:r>
     </w:p>
     <w:p>
       <w:pPr>
-        <w:rPr>
-          <w:rFonts w:asciiTheme="minorEastAsia" w:hAnsiTheme="minorEastAsia"/>
-          <w:b/>
-          <w:bCs/>
-        </w:rPr>
-      </w:pPr>
-      <w:r>
-        <w:rPr>
-          <w:rFonts w:asciiTheme="minorEastAsia" w:hAnsiTheme="minorEastAsia" w:hint="eastAsia"/>
-          <w:b/>
-          <w:bCs/>
-        </w:rPr>
-        <w:lastRenderedPageBreak/>
-        <w:t>在 「繁體中文版」 、 「</w:t>
-      </w:r>
-      <w:r>
-        <w:rPr>
-          <w:rFonts w:asciiTheme="minorEastAsia" w:hAnsiTheme="minorEastAsia"/>
-          <w:b/>
-          <w:bCs/>
-        </w:rPr>
-        <w:t>易經介紹</w:t>
-      </w:r>
-      <w:r>
-        <w:rPr>
-          <w:rFonts w:asciiTheme="minorEastAsia" w:hAnsiTheme="minorEastAsia" w:hint="eastAsia"/>
-          <w:b/>
-          <w:bCs/>
-        </w:rPr>
-        <w:t>」 頁面內容裡， 「</w:t>
-      </w:r>
-      <w:r>
-        <w:rPr>
-          <w:rFonts w:asciiTheme="minorEastAsia" w:hAnsiTheme="minorEastAsia"/>
-          <w:b/>
-          <w:bCs/>
-        </w:rPr>
-        <w:t>五、陰陽、八卦與六十四卦</w:t>
-      </w:r>
-      <w:r>
-        <w:rPr>
-          <w:rFonts w:asciiTheme="minorEastAsia" w:hAnsiTheme="minorEastAsia" w:hint="eastAsia"/>
-          <w:b/>
-          <w:bCs/>
-        </w:rPr>
-        <w:t>」 表格下方 ，插入下列</w:t>
-      </w:r>
-      <w:r>
-        <w:rPr>
-          <w:rFonts w:asciiTheme="minorEastAsia" w:hAnsiTheme="minorEastAsia"/>
-          <w:b/>
-          <w:bCs/>
-        </w:rPr>
-        <w:t>64掛爻象圖</w:t>
-      </w:r>
+        <w:pStyle w:val="a9"/>
+        <w:ind w:left="390" w:firstLineChars="100" w:firstLine="240"/>
+        <w:rPr>
+          <w:rFonts w:asciiTheme="minorEastAsia" w:hAnsiTheme="minorEastAsia" w:hint="eastAsia"/>
+          <w:b/>
+          <w:bCs/>
+        </w:rPr>
+      </w:pPr>
       <w:proofErr w:type="spellStart"/>
       <w:r>
         <w:rPr>
@@ -674,80 +1139,590 @@
           <w:b/>
           <w:bCs/>
         </w:rPr>
-        <w:t>svg</w:t>
+        <w:t>YiWord_Taiji_Bagua_ZH_</w:t>
+      </w:r>
+      <w:r>
+        <w:rPr>
+          <w:rFonts w:asciiTheme="minorEastAsia" w:hAnsiTheme="minorEastAsia" w:hint="eastAsia"/>
+          <w:b/>
+          <w:bCs/>
+        </w:rPr>
+        <w:t>CN</w:t>
+      </w:r>
+      <w:r>
+        <w:rPr>
+          <w:rFonts w:asciiTheme="minorEastAsia" w:hAnsiTheme="minorEastAsia"/>
+          <w:b/>
+          <w:bCs/>
+        </w:rPr>
+        <w:t>_Vector</w:t>
       </w:r>
       <w:proofErr w:type="spellEnd"/>
-      <w:r>
-        <w:rPr>
-          <w:rFonts w:asciiTheme="minorEastAsia" w:hAnsiTheme="minorEastAsia" w:hint="eastAsia"/>
-          <w:b/>
-          <w:bCs/>
-        </w:rPr>
-        <w:t>圖片</w:t>
-      </w:r>
     </w:p>
     <w:p>
       <w:pPr>
         <w:rPr>
-          <w:rFonts w:asciiTheme="minorEastAsia" w:hAnsiTheme="minorEastAsia"/>
-          <w:b/>
-          <w:bCs/>
-        </w:rPr>
-      </w:pPr>
-      <w:r>
-        <w:rPr>
-          <w:rFonts w:asciiTheme="minorEastAsia" w:hAnsiTheme="minorEastAsia" w:hint="eastAsia"/>
-          <w:b/>
-          <w:bCs/>
-        </w:rPr>
-        <w:t>標題為:</w:t>
-      </w:r>
-      <w:r>
-        <w:rPr>
-          <w:rFonts w:asciiTheme="minorEastAsia" w:hAnsiTheme="minorEastAsia" w:hint="eastAsia"/>
-          <w:b/>
-          <w:bCs/>
-        </w:rPr>
-        <w:t xml:space="preserve"> </w:t>
-      </w:r>
-      <w:r>
-        <w:rPr>
-          <w:rFonts w:asciiTheme="minorEastAsia" w:hAnsiTheme="minorEastAsia"/>
-          <w:b/>
-          <w:bCs/>
-        </w:rPr>
-        <w:t>兩儀四象八卦圖</w:t>
-      </w:r>
+          <w:rFonts w:ascii="微軟正黑體" w:eastAsia="微軟正黑體" w:hAnsi="微軟正黑體"/>
+        </w:rPr>
+      </w:pPr>
     </w:p>
     <w:p>
       <w:pPr>
         <w:rPr>
-          <w:rFonts w:ascii="微軟正黑體" w:eastAsia="微軟正黑體" w:hAnsi="微軟正黑體"/>
-        </w:rPr>
-      </w:pPr>
-      <w:proofErr w:type="spellStart"/>
-      <w:r>
-        <w:rPr>
-          <w:rFonts w:asciiTheme="minorEastAsia" w:hAnsiTheme="minorEastAsia"/>
-          <w:b/>
-          <w:bCs/>
-        </w:rPr>
-        <w:t>svg</w:t>
-      </w:r>
-      <w:proofErr w:type="spellEnd"/>
-      <w:r>
-        <w:rPr>
-          <w:rFonts w:asciiTheme="minorEastAsia" w:hAnsiTheme="minorEastAsia" w:hint="eastAsia"/>
-          <w:b/>
-          <w:bCs/>
-        </w:rPr>
-        <w:t>圖片:</w:t>
-      </w:r>
+          <w:rFonts w:ascii="微軟正黑體" w:eastAsia="微軟正黑體" w:hAnsi="微軟正黑體" w:hint="eastAsia"/>
+        </w:rPr>
+      </w:pPr>
     </w:p>
     <w:p>
       <w:pPr>
         <w:rPr>
+          <w:rFonts w:asciiTheme="minorEastAsia" w:hAnsiTheme="minorEastAsia"/>
+          <w:b/>
+          <w:bCs/>
+        </w:rPr>
+      </w:pPr>
+      <w:r>
+        <w:rPr>
+          <w:rFonts w:asciiTheme="minorEastAsia" w:hAnsiTheme="minorEastAsia" w:hint="eastAsia"/>
+          <w:b/>
+          <w:bCs/>
+        </w:rPr>
+        <w:lastRenderedPageBreak/>
+        <w:t>在 「</w:t>
+      </w:r>
+      <w:r>
+        <w:rPr>
+          <w:rFonts w:asciiTheme="minorEastAsia" w:hAnsiTheme="minorEastAsia" w:hint="eastAsia"/>
+          <w:b/>
+          <w:bCs/>
+        </w:rPr>
+        <w:t>EN英</w:t>
+      </w:r>
+      <w:r>
+        <w:rPr>
+          <w:rFonts w:asciiTheme="minorEastAsia" w:hAnsiTheme="minorEastAsia" w:hint="eastAsia"/>
+          <w:b/>
+          <w:bCs/>
+        </w:rPr>
+        <w:t>文版」 、 「</w:t>
+      </w:r>
+      <w:r>
+        <w:rPr>
+          <w:rFonts w:asciiTheme="minorEastAsia" w:hAnsiTheme="minorEastAsia"/>
+          <w:b/>
+          <w:bCs/>
+        </w:rPr>
+        <w:t>易經介紹</w:t>
+      </w:r>
+      <w:r>
+        <w:rPr>
+          <w:rFonts w:asciiTheme="minorEastAsia" w:hAnsiTheme="minorEastAsia" w:hint="eastAsia"/>
+          <w:b/>
+          <w:bCs/>
+        </w:rPr>
+        <w:t>」 頁面內容裡， 「</w:t>
+      </w:r>
+      <w:r>
+        <w:rPr>
+          <w:rFonts w:asciiTheme="minorEastAsia" w:hAnsiTheme="minorEastAsia"/>
+          <w:b/>
+          <w:bCs/>
+        </w:rPr>
+        <w:t>五、陰陽、八卦與六十四卦</w:t>
+      </w:r>
+      <w:r>
+        <w:rPr>
+          <w:rFonts w:asciiTheme="minorEastAsia" w:hAnsiTheme="minorEastAsia" w:hint="eastAsia"/>
+          <w:b/>
+          <w:bCs/>
+        </w:rPr>
+        <w:t>」 表格下方 ，插入下列</w:t>
+      </w:r>
+      <w:r>
+        <w:rPr>
+          <w:rFonts w:asciiTheme="minorEastAsia" w:hAnsiTheme="minorEastAsia" w:hint="eastAsia"/>
+          <w:b/>
+          <w:bCs/>
+        </w:rPr>
+        <w:t xml:space="preserve"> </w:t>
+      </w:r>
+      <w:r>
+        <w:rPr>
+          <w:rFonts w:asciiTheme="minorEastAsia" w:hAnsiTheme="minorEastAsia" w:hint="eastAsia"/>
+          <w:b/>
+          <w:bCs/>
+        </w:rPr>
+        <w:t xml:space="preserve"> </w:t>
+      </w:r>
+      <w:r>
+        <w:rPr>
+          <w:rFonts w:asciiTheme="minorEastAsia" w:hAnsiTheme="minorEastAsia" w:hint="eastAsia"/>
+          <w:b/>
+          <w:bCs/>
+        </w:rPr>
+        <w:t>「</w:t>
+      </w:r>
+      <w:r>
+        <w:rPr>
+          <w:rFonts w:asciiTheme="minorEastAsia" w:hAnsiTheme="minorEastAsia" w:hint="eastAsia"/>
+          <w:b/>
+          <w:bCs/>
+        </w:rPr>
+        <w:t>2張</w:t>
+      </w:r>
+      <w:r>
+        <w:rPr>
+          <w:rFonts w:asciiTheme="minorEastAsia" w:hAnsiTheme="minorEastAsia" w:hint="eastAsia"/>
+          <w:b/>
+          <w:bCs/>
+        </w:rPr>
+        <w:t>」</w:t>
+      </w:r>
+      <w:r>
+        <w:rPr>
+          <w:rFonts w:asciiTheme="minorEastAsia" w:hAnsiTheme="minorEastAsia" w:hint="eastAsia"/>
+          <w:b/>
+          <w:bCs/>
+        </w:rPr>
+        <w:t xml:space="preserve"> </w:t>
+      </w:r>
+      <w:r>
+        <w:rPr>
+          <w:rFonts w:asciiTheme="minorEastAsia" w:hAnsiTheme="minorEastAsia"/>
+          <w:b/>
+          <w:bCs/>
+        </w:rPr>
+        <w:t>64掛爻象圖</w:t>
+      </w:r>
+      <w:proofErr w:type="spellStart"/>
+      <w:r>
+        <w:rPr>
+          <w:rFonts w:asciiTheme="minorEastAsia" w:hAnsiTheme="minorEastAsia"/>
+          <w:b/>
+          <w:bCs/>
+        </w:rPr>
+        <w:t>svg</w:t>
+      </w:r>
+      <w:proofErr w:type="spellEnd"/>
+      <w:r>
+        <w:rPr>
+          <w:rFonts w:asciiTheme="minorEastAsia" w:hAnsiTheme="minorEastAsia" w:hint="eastAsia"/>
+          <w:b/>
+          <w:bCs/>
+        </w:rPr>
+        <w:t>圖片</w:t>
+      </w:r>
+      <w:r>
+        <w:rPr>
+          <w:rFonts w:asciiTheme="minorEastAsia" w:hAnsiTheme="minorEastAsia" w:hint="eastAsia"/>
+          <w:b/>
+          <w:bCs/>
+        </w:rPr>
+        <w:t>，</w:t>
+      </w:r>
+      <w:r>
+        <w:rPr>
+          <w:rFonts w:asciiTheme="minorEastAsia" w:hAnsiTheme="minorEastAsia"/>
+          <w:b/>
+          <w:bCs/>
+        </w:rPr>
+        <w:t>[</w:t>
+      </w:r>
+      <w:r>
+        <w:rPr>
+          <w:rFonts w:asciiTheme="minorEastAsia" w:hAnsiTheme="minorEastAsia" w:hint="eastAsia"/>
+          <w:b/>
+          <w:bCs/>
+        </w:rPr>
+        <w:t>上下分開排列]</w:t>
+      </w:r>
+    </w:p>
+    <w:p>
+      <w:pPr>
+        <w:rPr>
+          <w:rFonts w:asciiTheme="minorEastAsia" w:hAnsiTheme="minorEastAsia"/>
+          <w:b/>
+          <w:bCs/>
+        </w:rPr>
+      </w:pPr>
+      <w:r>
+        <w:rPr>
+          <w:rFonts w:asciiTheme="minorEastAsia" w:hAnsiTheme="minorEastAsia" w:hint="eastAsia"/>
+          <w:b/>
+          <w:bCs/>
+        </w:rPr>
+        <w:t>1、</w:t>
+      </w:r>
+      <w:r>
+        <w:rPr>
+          <w:rFonts w:asciiTheme="minorEastAsia" w:hAnsiTheme="minorEastAsia" w:hint="eastAsia"/>
+          <w:b/>
+          <w:bCs/>
+        </w:rPr>
+        <w:t xml:space="preserve">標題為: </w:t>
+      </w:r>
+      <w:r>
+        <w:rPr>
+          <w:rFonts w:asciiTheme="minorEastAsia" w:hAnsiTheme="minorEastAsia"/>
+          <w:b/>
+          <w:bCs/>
+        </w:rPr>
+        <w:t>太極兩儀四象八卦圖</w:t>
+      </w:r>
+    </w:p>
+    <w:p>
+      <w:pPr>
+        <w:ind w:firstLineChars="200" w:firstLine="480"/>
+        <w:rPr>
+          <w:rFonts w:asciiTheme="minorEastAsia" w:hAnsiTheme="minorEastAsia"/>
+          <w:b/>
+          <w:bCs/>
+        </w:rPr>
+      </w:pPr>
+      <w:r>
+        <w:rPr>
+          <w:rFonts w:asciiTheme="minorEastAsia" w:hAnsiTheme="minorEastAsia" w:hint="eastAsia"/>
+          <w:b/>
+          <w:bCs/>
+        </w:rPr>
+        <w:t xml:space="preserve"> </w:t>
+      </w:r>
+      <w:proofErr w:type="spellStart"/>
+      <w:r>
+        <w:rPr>
+          <w:rFonts w:asciiTheme="minorEastAsia" w:hAnsiTheme="minorEastAsia"/>
+          <w:b/>
+          <w:bCs/>
+        </w:rPr>
+        <w:t>svg</w:t>
+      </w:r>
+      <w:proofErr w:type="spellEnd"/>
+      <w:r>
+        <w:rPr>
+          <w:rFonts w:asciiTheme="minorEastAsia" w:hAnsiTheme="minorEastAsia" w:hint="eastAsia"/>
+          <w:b/>
+          <w:bCs/>
+        </w:rPr>
+        <w:t>圖片</w:t>
+      </w:r>
+      <w:r>
+        <w:rPr>
+          <w:rFonts w:asciiTheme="minorEastAsia" w:hAnsiTheme="minorEastAsia" w:hint="eastAsia"/>
+          <w:b/>
+          <w:bCs/>
+        </w:rPr>
+        <w:t xml:space="preserve">來源 </w:t>
+      </w:r>
+      <w:r>
+        <w:rPr>
+          <w:rFonts w:asciiTheme="minorEastAsia" w:hAnsiTheme="minorEastAsia" w:hint="eastAsia"/>
+          <w:b/>
+          <w:bCs/>
+        </w:rPr>
+        <w:t>:</w:t>
+      </w:r>
+      <w:r>
+        <w:rPr>
+          <w:rFonts w:asciiTheme="minorEastAsia" w:hAnsiTheme="minorEastAsia" w:hint="eastAsia"/>
+          <w:b/>
+          <w:bCs/>
+        </w:rPr>
+        <w:t xml:space="preserve"> </w:t>
+      </w:r>
+      <w:proofErr w:type="spellStart"/>
+      <w:r>
+        <w:rPr>
+          <w:rFonts w:asciiTheme="minorEastAsia" w:hAnsiTheme="minorEastAsia" w:hint="eastAsia"/>
+          <w:b/>
+          <w:bCs/>
+        </w:rPr>
+        <w:t>YiWordSite</w:t>
+      </w:r>
+      <w:proofErr w:type="spellEnd"/>
+      <w:r>
+        <w:rPr>
+          <w:rFonts w:asciiTheme="minorEastAsia" w:hAnsiTheme="minorEastAsia" w:hint="eastAsia"/>
+          <w:b/>
+          <w:bCs/>
+        </w:rPr>
+        <w:t xml:space="preserve"> 資料夾內、</w:t>
+      </w:r>
+      <w:r>
+        <w:rPr>
+          <w:rFonts w:asciiTheme="minorEastAsia" w:hAnsiTheme="minorEastAsia"/>
+          <w:b/>
+          <w:bCs/>
+        </w:rPr>
+        <w:t>d</w:t>
+      </w:r>
+      <w:r>
+        <w:rPr>
+          <w:rFonts w:asciiTheme="minorEastAsia" w:hAnsiTheme="minorEastAsia" w:hint="eastAsia"/>
+          <w:b/>
+          <w:bCs/>
+        </w:rPr>
+        <w:t>ocs內、</w:t>
+      </w:r>
+      <w:r>
+        <w:rPr>
+          <w:rFonts w:asciiTheme="minorEastAsia" w:hAnsiTheme="minorEastAsia"/>
+          <w:b/>
+          <w:bCs/>
+        </w:rPr>
+        <w:t>s</w:t>
+      </w:r>
+      <w:r>
+        <w:rPr>
+          <w:rFonts w:asciiTheme="minorEastAsia" w:hAnsiTheme="minorEastAsia" w:hint="eastAsia"/>
+          <w:b/>
+          <w:bCs/>
+        </w:rPr>
+        <w:t>ource docs內 之</w:t>
+      </w:r>
+      <w:r>
+        <w:rPr>
+          <w:rFonts w:asciiTheme="minorEastAsia" w:hAnsiTheme="minorEastAsia" w:hint="eastAsia"/>
+          <w:b/>
+          <w:bCs/>
+        </w:rPr>
+        <w:t xml:space="preserve"> </w:t>
+      </w:r>
+      <w:r>
+        <w:rPr>
+          <w:rFonts w:asciiTheme="minorEastAsia" w:hAnsiTheme="minorEastAsia" w:hint="eastAsia"/>
+          <w:b/>
+          <w:bCs/>
+        </w:rPr>
+        <w:t xml:space="preserve">   </w:t>
+      </w:r>
+    </w:p>
+    <w:p>
+      <w:pPr>
+        <w:rPr>
+          <w:rFonts w:asciiTheme="minorEastAsia" w:hAnsiTheme="minorEastAsia"/>
+          <w:b/>
+          <w:bCs/>
+        </w:rPr>
+      </w:pPr>
+      <w:r>
+        <w:rPr>
+          <w:rFonts w:asciiTheme="minorEastAsia" w:hAnsiTheme="minorEastAsia" w:hint="eastAsia"/>
+          <w:b/>
+          <w:bCs/>
+        </w:rPr>
+        <w:t xml:space="preserve">      </w:t>
+      </w:r>
+      <w:proofErr w:type="spellStart"/>
+      <w:r>
+        <w:rPr>
+          <w:rFonts w:asciiTheme="minorEastAsia" w:hAnsiTheme="minorEastAsia"/>
+          <w:b/>
+          <w:bCs/>
+        </w:rPr>
+        <w:t>YiWord_Taiji_Bagua_ZH_TW_EN_Diagram_Only</w:t>
+      </w:r>
+      <w:proofErr w:type="spellEnd"/>
+    </w:p>
+    <w:p>
+      <w:pPr>
+        <w:rPr>
+          <w:rFonts w:asciiTheme="minorEastAsia" w:hAnsiTheme="minorEastAsia"/>
+          <w:b/>
+          <w:bCs/>
+        </w:rPr>
+      </w:pPr>
+      <w:r>
+        <w:rPr>
+          <w:rFonts w:asciiTheme="minorEastAsia" w:hAnsiTheme="minorEastAsia" w:hint="eastAsia"/>
+          <w:b/>
+          <w:bCs/>
+        </w:rPr>
+        <w:t>2、</w:t>
+      </w:r>
+      <w:r>
+        <w:rPr>
+          <w:rFonts w:asciiTheme="minorEastAsia" w:hAnsiTheme="minorEastAsia" w:hint="eastAsia"/>
+          <w:b/>
+          <w:bCs/>
+        </w:rPr>
+        <w:t xml:space="preserve">標題為: </w:t>
+      </w:r>
+      <w:r>
+        <w:rPr>
+          <w:rFonts w:asciiTheme="minorEastAsia" w:hAnsiTheme="minorEastAsia"/>
+          <w:b/>
+          <w:bCs/>
+        </w:rPr>
+        <w:t>兩儀四象八卦圖</w:t>
+      </w:r>
+    </w:p>
+    <w:p>
+      <w:pPr>
+        <w:ind w:firstLineChars="200" w:firstLine="480"/>
+        <w:rPr>
+          <w:rFonts w:asciiTheme="minorEastAsia" w:hAnsiTheme="minorEastAsia"/>
+          <w:b/>
+          <w:bCs/>
+        </w:rPr>
+      </w:pPr>
+      <w:proofErr w:type="spellStart"/>
+      <w:r>
+        <w:rPr>
+          <w:rFonts w:asciiTheme="minorEastAsia" w:hAnsiTheme="minorEastAsia"/>
+          <w:b/>
+          <w:bCs/>
+        </w:rPr>
+        <w:t>svg</w:t>
+      </w:r>
+      <w:proofErr w:type="spellEnd"/>
+      <w:r>
+        <w:rPr>
+          <w:rFonts w:asciiTheme="minorEastAsia" w:hAnsiTheme="minorEastAsia" w:hint="eastAsia"/>
+          <w:b/>
+          <w:bCs/>
+        </w:rPr>
+        <w:t>圖片</w:t>
+      </w:r>
+      <w:r>
+        <w:rPr>
+          <w:rFonts w:asciiTheme="minorEastAsia" w:hAnsiTheme="minorEastAsia" w:hint="eastAsia"/>
+          <w:b/>
+          <w:bCs/>
+        </w:rPr>
+        <w:t xml:space="preserve">來源 </w:t>
+      </w:r>
+      <w:r>
+        <w:rPr>
+          <w:rFonts w:asciiTheme="minorEastAsia" w:hAnsiTheme="minorEastAsia" w:hint="eastAsia"/>
+          <w:b/>
+          <w:bCs/>
+        </w:rPr>
+        <w:t>:</w:t>
+      </w:r>
+      <w:r>
+        <w:rPr>
+          <w:rFonts w:asciiTheme="minorEastAsia" w:hAnsiTheme="minorEastAsia" w:hint="eastAsia"/>
+          <w:b/>
+          <w:bCs/>
+        </w:rPr>
+        <w:t xml:space="preserve"> </w:t>
+      </w:r>
+      <w:proofErr w:type="spellStart"/>
+      <w:r>
+        <w:rPr>
+          <w:rFonts w:asciiTheme="minorEastAsia" w:hAnsiTheme="minorEastAsia" w:hint="eastAsia"/>
+          <w:b/>
+          <w:bCs/>
+        </w:rPr>
+        <w:t>YiWordSite</w:t>
+      </w:r>
+      <w:proofErr w:type="spellEnd"/>
+      <w:r>
+        <w:rPr>
+          <w:rFonts w:asciiTheme="minorEastAsia" w:hAnsiTheme="minorEastAsia" w:hint="eastAsia"/>
+          <w:b/>
+          <w:bCs/>
+        </w:rPr>
+        <w:t xml:space="preserve"> 資料夾內、</w:t>
+      </w:r>
+      <w:r>
+        <w:rPr>
+          <w:rFonts w:asciiTheme="minorEastAsia" w:hAnsiTheme="minorEastAsia"/>
+          <w:b/>
+          <w:bCs/>
+        </w:rPr>
+        <w:t>d</w:t>
+      </w:r>
+      <w:r>
+        <w:rPr>
+          <w:rFonts w:asciiTheme="minorEastAsia" w:hAnsiTheme="minorEastAsia" w:hint="eastAsia"/>
+          <w:b/>
+          <w:bCs/>
+        </w:rPr>
+        <w:t>ocs內、</w:t>
+      </w:r>
+      <w:r>
+        <w:rPr>
+          <w:rFonts w:asciiTheme="minorEastAsia" w:hAnsiTheme="minorEastAsia"/>
+          <w:b/>
+          <w:bCs/>
+        </w:rPr>
+        <w:t>s</w:t>
+      </w:r>
+      <w:r>
+        <w:rPr>
+          <w:rFonts w:asciiTheme="minorEastAsia" w:hAnsiTheme="minorEastAsia" w:hint="eastAsia"/>
+          <w:b/>
+          <w:bCs/>
+        </w:rPr>
+        <w:t>ource docs內 之</w:t>
+      </w:r>
+      <w:r>
+        <w:rPr>
+          <w:rFonts w:asciiTheme="minorEastAsia" w:hAnsiTheme="minorEastAsia" w:hint="eastAsia"/>
+          <w:b/>
+          <w:bCs/>
+        </w:rPr>
+        <w:t xml:space="preserve"> </w:t>
+      </w:r>
+      <w:r>
+        <w:rPr>
+          <w:rFonts w:asciiTheme="minorEastAsia" w:hAnsiTheme="minorEastAsia" w:hint="eastAsia"/>
+          <w:b/>
+          <w:bCs/>
+        </w:rPr>
+        <w:t xml:space="preserve">   </w:t>
+      </w:r>
+    </w:p>
+    <w:p>
+      <w:pPr>
+        <w:pStyle w:val="a9"/>
+        <w:ind w:left="390" w:firstLineChars="100" w:firstLine="240"/>
+        <w:rPr>
+          <w:rFonts w:asciiTheme="minorEastAsia" w:hAnsiTheme="minorEastAsia" w:hint="eastAsia"/>
+          <w:b/>
+          <w:bCs/>
+        </w:rPr>
+      </w:pPr>
+      <w:proofErr w:type="spellStart"/>
+      <w:r>
+        <w:rPr>
+          <w:rFonts w:asciiTheme="minorEastAsia" w:hAnsiTheme="minorEastAsia"/>
+          <w:b/>
+          <w:bCs/>
+        </w:rPr>
+        <w:t>YiWord_Taiji_Bagua_ZH_</w:t>
+      </w:r>
+      <w:r>
+        <w:rPr>
+          <w:rFonts w:asciiTheme="minorEastAsia" w:hAnsiTheme="minorEastAsia" w:hint="eastAsia"/>
+          <w:b/>
+          <w:bCs/>
+        </w:rPr>
+        <w:t>TW_EN</w:t>
+      </w:r>
+      <w:r>
+        <w:rPr>
+          <w:rFonts w:asciiTheme="minorEastAsia" w:hAnsiTheme="minorEastAsia"/>
+          <w:b/>
+          <w:bCs/>
+        </w:rPr>
+        <w:t>_Vector</w:t>
+      </w:r>
+      <w:proofErr w:type="spellEnd"/>
+    </w:p>
+    <w:p>
+      <w:pPr>
+        <w:rPr>
           <w:rFonts w:ascii="微軟正黑體" w:eastAsia="微軟正黑體" w:hAnsi="微軟正黑體"/>
+        </w:rPr>
+      </w:pPr>
+    </w:p>
+    <w:p>
+      <w:pPr>
+        <w:widowControl/>
+        <w:rPr>
+          <w:rFonts w:ascii="微軟正黑體" w:eastAsia="微軟正黑體" w:hAnsi="微軟正黑體" w:hint="eastAsia"/>
         </w:rPr>
       </w:pPr>
     </w:p>
@@ -759,6 +1734,103 @@
     </w:sectPr>
   </w:body>
 </w:document>
+</file>
+
+<file path=word/numbering.xml><?xml version="1.0" encoding="utf-8"?>
+<w:numbering xmlns:wpc="http://schemas.microsoft.com/office/word/2010/wordprocessingCanvas" xmlns:cx="http://schemas.microsoft.com/office/drawing/2014/chartex" xmlns:cx1="http://schemas.microsoft.com/office/drawing/2015/9/8/chartex" xmlns:cx2="http://schemas.microsoft.com/office/drawing/2015/10/21/chartex" xmlns:cx3="http://schemas.microsoft.com/office/drawing/2016/5/9/chartex" xmlns:cx4="http://schemas.microsoft.com/office/drawing/2016/5/10/chartex" xmlns:cx5="http://schemas.microsoft.com/office/drawing/2016/5/11/chartex" xmlns:cx6="http://schemas.microsoft.com/office/drawing/2016/5/12/chartex" xmlns:cx7="http://schemas.microsoft.com/office/drawing/2016/5/13/chartex" xmlns:cx8="http://schemas.microsoft.com/office/drawing/2016/5/14/chartex" xmlns:mc="http://schemas.openxmlformats.org/markup-compatibility/2006" xmlns:aink="http://schemas.microsoft.com/office/drawing/2016/ink" xmlns:am3d="http://schemas.microsoft.com/office/drawing/2017/model3d" xmlns:o="urn:schemas-microsoft-com:office:office" xmlns:oel="http://schemas.microsoft.com/office/2019/extlst" xmlns:r="http://schemas.openxmlformats.org/officeDocument/2006/relationships" xmlns:m="http://schemas.openxmlformats.org/officeDocument/2006/math" xmlns:v="urn:schemas-microsoft-com:vml" xmlns:wp14="http://schemas.microsoft.com/office/word/2010/wordprocessingDrawing" xmlns:wp="http://schemas.openxmlformats.org/drawingml/2006/wordprocessingDrawing" xmlns:w10="urn:schemas-microsoft-com:office:word" xmlns:w="http://schemas.openxmlformats.org/wordprocessingml/2006/main" xmlns:w14="http://schemas.microsoft.com/office/word/2010/wordml" xmlns:w15="http://schemas.microsoft.com/office/word/2012/wordml" xmlns:w16cex="http://schemas.microsoft.com/office/word/2018/wordml/cex" xmlns:w16cid="http://schemas.microsoft.com/office/word/2016/wordml/cid" xmlns:w16="http://schemas.microsoft.com/office/word/2018/wordml" xmlns:w16du="http://schemas.microsoft.com/office/word/2023/wordml/word16du" xmlns:w16sdtdh="http://schemas.microsoft.com/office/word/2020/wordml/sdtdatahash" xmlns:w16sdtfl="http://schemas.microsoft.com/office/word/2024/wordml/sdtformatlock" xmlns:w16se="http://schemas.microsoft.com/office/word/2015/wordml/symex" xmlns:wpg="http://schemas.microsoft.com/office/word/2010/wordprocessingGroup" xmlns:wpi="http://schemas.microsoft.com/office/word/2010/wordprocessingInk" xmlns:wne="http://schemas.microsoft.com/office/word/2006/wordml" xmlns:wps="http://schemas.microsoft.com/office/word/2010/wordprocessingShape" mc:Ignorable="w14 w15 w16se w16cid w16 w16cex w16sdtdh w16sdtfl w16du wp14">
+  <w:abstractNum w:abstractNumId="0" w15:restartNumberingAfterBreak="0">
+    <w:nsid w:val="30336021"/>
+    <w:multiLevelType w:val="hybridMultilevel"/>
+    <w:tmpl w:val="DCF2A94A"/>
+    <w:lvl w:ilvl="0" w:tplc="F39AEA5E">
+      <w:start w:val="2"/>
+      <w:numFmt w:val="decimal"/>
+      <w:lvlText w:val="%1、"/>
+      <w:lvlJc w:val="left"/>
+      <w:pPr>
+        <w:ind w:left="390" w:hanging="390"/>
+      </w:pPr>
+      <w:rPr>
+        <w:rFonts w:hint="default"/>
+      </w:rPr>
+    </w:lvl>
+    <w:lvl w:ilvl="1" w:tplc="04090019" w:tentative="1">
+      <w:start w:val="1"/>
+      <w:numFmt w:val="ideographTraditional"/>
+      <w:lvlText w:val="%2、"/>
+      <w:lvlJc w:val="left"/>
+      <w:pPr>
+        <w:ind w:left="960" w:hanging="480"/>
+      </w:pPr>
+    </w:lvl>
+    <w:lvl w:ilvl="2" w:tplc="0409001B" w:tentative="1">
+      <w:start w:val="1"/>
+      <w:numFmt w:val="lowerRoman"/>
+      <w:lvlText w:val="%3."/>
+      <w:lvlJc w:val="right"/>
+      <w:pPr>
+        <w:ind w:left="1440" w:hanging="480"/>
+      </w:pPr>
+    </w:lvl>
+    <w:lvl w:ilvl="3" w:tplc="0409000F" w:tentative="1">
+      <w:start w:val="1"/>
+      <w:numFmt w:val="decimal"/>
+      <w:lvlText w:val="%4."/>
+      <w:lvlJc w:val="left"/>
+      <w:pPr>
+        <w:ind w:left="1920" w:hanging="480"/>
+      </w:pPr>
+    </w:lvl>
+    <w:lvl w:ilvl="4" w:tplc="04090019" w:tentative="1">
+      <w:start w:val="1"/>
+      <w:numFmt w:val="ideographTraditional"/>
+      <w:lvlText w:val="%5、"/>
+      <w:lvlJc w:val="left"/>
+      <w:pPr>
+        <w:ind w:left="2400" w:hanging="480"/>
+      </w:pPr>
+    </w:lvl>
+    <w:lvl w:ilvl="5" w:tplc="0409001B" w:tentative="1">
+      <w:start w:val="1"/>
+      <w:numFmt w:val="lowerRoman"/>
+      <w:lvlText w:val="%6."/>
+      <w:lvlJc w:val="right"/>
+      <w:pPr>
+        <w:ind w:left="2880" w:hanging="480"/>
+      </w:pPr>
+    </w:lvl>
+    <w:lvl w:ilvl="6" w:tplc="0409000F" w:tentative="1">
+      <w:start w:val="1"/>
+      <w:numFmt w:val="decimal"/>
+      <w:lvlText w:val="%7."/>
+      <w:lvlJc w:val="left"/>
+      <w:pPr>
+        <w:ind w:left="3360" w:hanging="480"/>
+      </w:pPr>
+    </w:lvl>
+    <w:lvl w:ilvl="7" w:tplc="04090019" w:tentative="1">
+      <w:start w:val="1"/>
+      <w:numFmt w:val="ideographTraditional"/>
+      <w:lvlText w:val="%8、"/>
+      <w:lvlJc w:val="left"/>
+      <w:pPr>
+        <w:ind w:left="3840" w:hanging="480"/>
+      </w:pPr>
+    </w:lvl>
+    <w:lvl w:ilvl="8" w:tplc="0409001B" w:tentative="1">
+      <w:start w:val="1"/>
+      <w:numFmt w:val="lowerRoman"/>
+      <w:lvlText w:val="%9."/>
+      <w:lvlJc w:val="right"/>
+      <w:pPr>
+        <w:ind w:left="4320" w:hanging="480"/>
+      </w:pPr>
+    </w:lvl>
+  </w:abstractNum>
+  <w:num w:numId="1" w16cid:durableId="820541758">
+    <w:abstractNumId w:val="0"/>
+  </w:num>
+</w:numbering>
 </file>
 
 <file path=word/styles.xml><?xml version="1.0" encoding="utf-8"?>

</xml_diff>